<commit_message>
Update CA1 Statistical Techniques.docx
Updating the cover page
</commit_message>
<xml_diff>
--- a/CA1 Statistical Techniques.docx
+++ b/CA1 Statistical Techniques.docx
@@ -4,8 +4,1006 @@
   <w:body>
     <w:p>
       <w:r>
-        <w:t>Introduction</w:t>
+        <w:rPr>
+          <w:noProof/>
+          <w:sz w:val="20"/>
+          <w:szCs w:val="20"/>
+        </w:rPr>
+        <w:drawing>
+          <wp:anchor distT="0" distB="0" distL="114300" distR="114300" simplePos="0" relativeHeight="251659264" behindDoc="0" locked="0" layoutInCell="1" allowOverlap="1" wp14:anchorId="31C4A150" wp14:editId="5F6D473D">
+            <wp:simplePos x="0" y="0"/>
+            <wp:positionH relativeFrom="margin">
+              <wp:posOffset>0</wp:posOffset>
+            </wp:positionH>
+            <wp:positionV relativeFrom="margin">
+              <wp:posOffset>289560</wp:posOffset>
+            </wp:positionV>
+            <wp:extent cx="4645660" cy="1347470"/>
+            <wp:effectExtent l="0" t="0" r="2540" b="5080"/>
+            <wp:wrapSquare wrapText="bothSides"/>
+            <wp:docPr id="31" name="image1.png" descr="A picture containing icon&#10;&#10;Description automatically generated"/>
+            <wp:cNvGraphicFramePr/>
+            <a:graphic xmlns:a="http://schemas.openxmlformats.org/drawingml/2006/main">
+              <a:graphicData uri="http://schemas.openxmlformats.org/drawingml/2006/picture">
+                <pic:pic xmlns:pic="http://schemas.openxmlformats.org/drawingml/2006/picture">
+                  <pic:nvPicPr>
+                    <pic:cNvPr id="0" name="image1.png" descr="A picture containing icon&#10;&#10;Description automatically generated"/>
+                    <pic:cNvPicPr preferRelativeResize="0"/>
+                  </pic:nvPicPr>
+                  <pic:blipFill>
+                    <a:blip r:embed="rId4">
+                      <a:extLst>
+                        <a:ext uri="{28A0092B-C50C-407E-A947-70E740481C1C}">
+                          <a14:useLocalDpi xmlns:a14="http://schemas.microsoft.com/office/drawing/2010/main" val="0"/>
+                        </a:ext>
+                      </a:extLst>
+                    </a:blip>
+                    <a:srcRect/>
+                    <a:stretch>
+                      <a:fillRect/>
+                    </a:stretch>
+                  </pic:blipFill>
+                  <pic:spPr>
+                    <a:xfrm>
+                      <a:off x="0" y="0"/>
+                      <a:ext cx="4645660" cy="1347470"/>
+                    </a:xfrm>
+                    <a:prstGeom prst="rect">
+                      <a:avLst/>
+                    </a:prstGeom>
+                    <a:ln/>
+                  </pic:spPr>
+                </pic:pic>
+              </a:graphicData>
+            </a:graphic>
+          </wp:anchor>
+        </w:drawing>
       </w:r>
+    </w:p>
+    <w:p/>
+    <w:p/>
+    <w:p/>
+    <w:p/>
+    <w:p>
+      <w:pPr>
+        <w:jc w:val="center"/>
+      </w:pPr>
+    </w:p>
+    <w:p>
+      <w:pPr>
+        <w:jc w:val="center"/>
+        <w:rPr>
+          <w:b/>
+          <w:sz w:val="20"/>
+          <w:szCs w:val="20"/>
+          <w:lang w:val="en-GB"/>
+        </w:rPr>
+      </w:pPr>
+      <w:r>
+        <w:rPr>
+          <w:b/>
+          <w:sz w:val="20"/>
+          <w:szCs w:val="20"/>
+          <w:lang w:val="en-GB"/>
+        </w:rPr>
+        <w:t>CCT College Dublin Continuous Assessment</w:t>
+      </w:r>
+    </w:p>
+    <w:tbl>
+      <w:tblPr>
+        <w:tblW w:w="8467" w:type="dxa"/>
+        <w:tblInd w:w="-108" w:type="dxa"/>
+        <w:tblBorders>
+          <w:top w:val="single" w:sz="4" w:space="0" w:color="000000"/>
+          <w:left w:val="single" w:sz="4" w:space="0" w:color="000000"/>
+          <w:bottom w:val="single" w:sz="4" w:space="0" w:color="000000"/>
+          <w:right w:val="single" w:sz="4" w:space="0" w:color="000000"/>
+          <w:insideH w:val="single" w:sz="4" w:space="0" w:color="000000"/>
+          <w:insideV w:val="single" w:sz="4" w:space="0" w:color="000000"/>
+        </w:tblBorders>
+        <w:tblLayout w:type="fixed"/>
+        <w:tblLook w:val="0400" w:firstRow="0" w:lastRow="0" w:firstColumn="0" w:lastColumn="0" w:noHBand="0" w:noVBand="1"/>
+      </w:tblPr>
+      <w:tblGrid>
+        <w:gridCol w:w="2088"/>
+        <w:gridCol w:w="2835"/>
+        <w:gridCol w:w="1876"/>
+        <w:gridCol w:w="1668"/>
+      </w:tblGrid>
+      <w:tr>
+        <w:tc>
+          <w:tcPr>
+            <w:tcW w:w="2088" w:type="dxa"/>
+          </w:tcPr>
+          <w:p>
+            <w:pPr>
+              <w:rPr>
+                <w:b/>
+                <w:sz w:val="20"/>
+                <w:szCs w:val="20"/>
+              </w:rPr>
+            </w:pPr>
+            <w:r>
+              <w:rPr>
+                <w:b/>
+                <w:sz w:val="20"/>
+                <w:szCs w:val="20"/>
+              </w:rPr>
+              <w:t xml:space="preserve">Student full </w:t>
+            </w:r>
+            <w:proofErr w:type="spellStart"/>
+            <w:r>
+              <w:rPr>
+                <w:b/>
+                <w:sz w:val="20"/>
+                <w:szCs w:val="20"/>
+              </w:rPr>
+              <w:t>name</w:t>
+            </w:r>
+            <w:proofErr w:type="spellEnd"/>
+            <w:r>
+              <w:rPr>
+                <w:b/>
+                <w:sz w:val="20"/>
+                <w:szCs w:val="20"/>
+              </w:rPr>
+              <w:t>:</w:t>
+            </w:r>
+          </w:p>
+        </w:tc>
+        <w:tc>
+          <w:tcPr>
+            <w:tcW w:w="6379" w:type="dxa"/>
+            <w:gridSpan w:val="3"/>
+          </w:tcPr>
+          <w:p>
+            <w:pPr>
+              <w:rPr>
+                <w:sz w:val="20"/>
+                <w:szCs w:val="20"/>
+                <w:lang w:val="en-GB"/>
+              </w:rPr>
+            </w:pPr>
+            <w:r>
+              <w:rPr>
+                <w:sz w:val="20"/>
+                <w:szCs w:val="20"/>
+                <w:lang w:val="en-GB"/>
+              </w:rPr>
+              <w:t>Alejandro Ivan Mendoza Ibarrola</w:t>
+            </w:r>
+          </w:p>
+        </w:tc>
+      </w:tr>
+      <w:tr>
+        <w:tc>
+          <w:tcPr>
+            <w:tcW w:w="2088" w:type="dxa"/>
+          </w:tcPr>
+          <w:p>
+            <w:pPr>
+              <w:rPr>
+                <w:b/>
+                <w:sz w:val="20"/>
+                <w:szCs w:val="20"/>
+              </w:rPr>
+            </w:pPr>
+            <w:r>
+              <w:rPr>
+                <w:b/>
+                <w:sz w:val="20"/>
+                <w:szCs w:val="20"/>
+              </w:rPr>
+              <w:t xml:space="preserve">Student </w:t>
+            </w:r>
+            <w:proofErr w:type="spellStart"/>
+            <w:r>
+              <w:rPr>
+                <w:b/>
+                <w:sz w:val="20"/>
+                <w:szCs w:val="20"/>
+              </w:rPr>
+              <w:t>number</w:t>
+            </w:r>
+            <w:proofErr w:type="spellEnd"/>
+            <w:r>
+              <w:rPr>
+                <w:b/>
+                <w:sz w:val="20"/>
+                <w:szCs w:val="20"/>
+              </w:rPr>
+              <w:t>:</w:t>
+            </w:r>
+          </w:p>
+        </w:tc>
+        <w:tc>
+          <w:tcPr>
+            <w:tcW w:w="6379" w:type="dxa"/>
+            <w:gridSpan w:val="3"/>
+          </w:tcPr>
+          <w:p>
+            <w:pPr>
+              <w:rPr>
+                <w:sz w:val="20"/>
+                <w:szCs w:val="20"/>
+                <w:lang w:val="en-GB"/>
+              </w:rPr>
+            </w:pPr>
+            <w:r>
+              <w:rPr>
+                <w:sz w:val="20"/>
+                <w:szCs w:val="20"/>
+                <w:lang w:val="en-GB"/>
+              </w:rPr>
+              <w:t>2026506</w:t>
+            </w:r>
+          </w:p>
+        </w:tc>
+      </w:tr>
+      <w:tr>
+        <w:tc>
+          <w:tcPr>
+            <w:tcW w:w="2088" w:type="dxa"/>
+          </w:tcPr>
+          <w:p>
+            <w:pPr>
+              <w:rPr>
+                <w:b/>
+                <w:sz w:val="20"/>
+                <w:szCs w:val="20"/>
+              </w:rPr>
+            </w:pPr>
+            <w:proofErr w:type="spellStart"/>
+            <w:r>
+              <w:rPr>
+                <w:b/>
+                <w:sz w:val="20"/>
+                <w:szCs w:val="20"/>
+              </w:rPr>
+              <w:t>Programme</w:t>
+            </w:r>
+            <w:proofErr w:type="spellEnd"/>
+            <w:r>
+              <w:rPr>
+                <w:b/>
+                <w:sz w:val="20"/>
+                <w:szCs w:val="20"/>
+              </w:rPr>
+              <w:t xml:space="preserve"> Title:</w:t>
+            </w:r>
+          </w:p>
+        </w:tc>
+        <w:tc>
+          <w:tcPr>
+            <w:tcW w:w="6379" w:type="dxa"/>
+            <w:gridSpan w:val="3"/>
+          </w:tcPr>
+          <w:p>
+            <w:pPr>
+              <w:rPr>
+                <w:i/>
+                <w:lang w:val="en-GB"/>
+              </w:rPr>
+            </w:pPr>
+            <w:r>
+              <w:rPr>
+                <w:lang w:val="en-GB"/>
+              </w:rPr>
+              <w:t>Higher Diploma in Data Analytics in Business</w:t>
+            </w:r>
+          </w:p>
+        </w:tc>
+      </w:tr>
+      <w:tr>
+        <w:tc>
+          <w:tcPr>
+            <w:tcW w:w="2088" w:type="dxa"/>
+          </w:tcPr>
+          <w:p>
+            <w:pPr>
+              <w:rPr>
+                <w:b/>
+                <w:sz w:val="20"/>
+                <w:szCs w:val="20"/>
+              </w:rPr>
+            </w:pPr>
+            <w:proofErr w:type="spellStart"/>
+            <w:r>
+              <w:rPr>
+                <w:b/>
+                <w:sz w:val="20"/>
+                <w:szCs w:val="20"/>
+              </w:rPr>
+              <w:t>Cohort</w:t>
+            </w:r>
+            <w:proofErr w:type="spellEnd"/>
+            <w:r>
+              <w:rPr>
+                <w:b/>
+                <w:sz w:val="20"/>
+                <w:szCs w:val="20"/>
+              </w:rPr>
+              <w:t xml:space="preserve"> </w:t>
+            </w:r>
+            <w:proofErr w:type="spellStart"/>
+            <w:r>
+              <w:rPr>
+                <w:b/>
+                <w:sz w:val="20"/>
+                <w:szCs w:val="20"/>
+              </w:rPr>
+              <w:t>Details</w:t>
+            </w:r>
+            <w:proofErr w:type="spellEnd"/>
+            <w:r>
+              <w:rPr>
+                <w:b/>
+                <w:sz w:val="20"/>
+                <w:szCs w:val="20"/>
+              </w:rPr>
+              <w:t>:</w:t>
+            </w:r>
+          </w:p>
+        </w:tc>
+        <w:tc>
+          <w:tcPr>
+            <w:tcW w:w="6379" w:type="dxa"/>
+            <w:gridSpan w:val="3"/>
+          </w:tcPr>
+          <w:p>
+            <w:pPr>
+              <w:rPr>
+                <w:i/>
+                <w:sz w:val="20"/>
+                <w:szCs w:val="20"/>
+                <w:lang w:val="en-GB"/>
+              </w:rPr>
+            </w:pPr>
+            <w:r>
+              <w:rPr>
+                <w:i/>
+                <w:sz w:val="20"/>
+                <w:szCs w:val="20"/>
+                <w:lang w:val="en-GB"/>
+              </w:rPr>
+              <w:t>Higher Diploma in Data Analytics in Business - Sept 26 FT- Stage 1 Sem 1</w:t>
+            </w:r>
+          </w:p>
+        </w:tc>
+      </w:tr>
+      <w:tr>
+        <w:tc>
+          <w:tcPr>
+            <w:tcW w:w="2088" w:type="dxa"/>
+          </w:tcPr>
+          <w:p>
+            <w:pPr>
+              <w:rPr>
+                <w:sz w:val="20"/>
+                <w:szCs w:val="20"/>
+              </w:rPr>
+            </w:pPr>
+            <w:r>
+              <w:rPr>
+                <w:b/>
+                <w:sz w:val="20"/>
+                <w:szCs w:val="20"/>
+              </w:rPr>
+              <w:t>Module Title(s)</w:t>
+            </w:r>
+            <w:r>
+              <w:rPr>
+                <w:sz w:val="20"/>
+                <w:szCs w:val="20"/>
+              </w:rPr>
+              <w:t>:</w:t>
+            </w:r>
+          </w:p>
+        </w:tc>
+        <w:tc>
+          <w:tcPr>
+            <w:tcW w:w="6379" w:type="dxa"/>
+            <w:gridSpan w:val="3"/>
+          </w:tcPr>
+          <w:p>
+            <w:pPr>
+              <w:rPr>
+                <w:i/>
+                <w:sz w:val="20"/>
+                <w:szCs w:val="20"/>
+                <w:lang w:val="nb-NO"/>
+              </w:rPr>
+            </w:pPr>
+            <w:r>
+              <w:rPr>
+                <w:i/>
+                <w:sz w:val="20"/>
+                <w:szCs w:val="20"/>
+                <w:lang w:val="nb-NO"/>
+              </w:rPr>
+              <w:t xml:space="preserve">Stats for Data Analytics </w:t>
+            </w:r>
+          </w:p>
+        </w:tc>
+      </w:tr>
+      <w:tr>
+        <w:tc>
+          <w:tcPr>
+            <w:tcW w:w="2088" w:type="dxa"/>
+          </w:tcPr>
+          <w:p>
+            <w:pPr>
+              <w:rPr>
+                <w:b/>
+                <w:sz w:val="20"/>
+                <w:szCs w:val="20"/>
+              </w:rPr>
+            </w:pPr>
+            <w:proofErr w:type="spellStart"/>
+            <w:r>
+              <w:rPr>
+                <w:b/>
+                <w:sz w:val="20"/>
+                <w:szCs w:val="20"/>
+              </w:rPr>
+              <w:t>Assignment</w:t>
+            </w:r>
+            <w:proofErr w:type="spellEnd"/>
+            <w:r>
+              <w:rPr>
+                <w:b/>
+                <w:sz w:val="20"/>
+                <w:szCs w:val="20"/>
+              </w:rPr>
+              <w:t xml:space="preserve"> </w:t>
+            </w:r>
+            <w:proofErr w:type="spellStart"/>
+            <w:r>
+              <w:rPr>
+                <w:b/>
+                <w:sz w:val="20"/>
+                <w:szCs w:val="20"/>
+              </w:rPr>
+              <w:t>Type</w:t>
+            </w:r>
+            <w:proofErr w:type="spellEnd"/>
+            <w:r>
+              <w:rPr>
+                <w:b/>
+                <w:sz w:val="20"/>
+                <w:szCs w:val="20"/>
+              </w:rPr>
+              <w:t>:</w:t>
+            </w:r>
+          </w:p>
+        </w:tc>
+        <w:tc>
+          <w:tcPr>
+            <w:tcW w:w="2835" w:type="dxa"/>
+          </w:tcPr>
+          <w:p>
+            <w:pPr>
+              <w:rPr>
+                <w:i/>
+                <w:sz w:val="20"/>
+                <w:szCs w:val="20"/>
+              </w:rPr>
+            </w:pPr>
+            <w:r>
+              <w:rPr>
+                <w:i/>
+                <w:sz w:val="20"/>
+                <w:szCs w:val="20"/>
+              </w:rPr>
+              <w:t>Individual</w:t>
+            </w:r>
+          </w:p>
+        </w:tc>
+        <w:tc>
+          <w:tcPr>
+            <w:tcW w:w="1876" w:type="dxa"/>
+          </w:tcPr>
+          <w:p>
+            <w:pPr>
+              <w:rPr>
+                <w:b/>
+                <w:sz w:val="20"/>
+                <w:szCs w:val="20"/>
+              </w:rPr>
+            </w:pPr>
+            <w:proofErr w:type="spellStart"/>
+            <w:r>
+              <w:rPr>
+                <w:b/>
+                <w:sz w:val="20"/>
+                <w:szCs w:val="20"/>
+              </w:rPr>
+              <w:t>Weighting</w:t>
+            </w:r>
+            <w:proofErr w:type="spellEnd"/>
+            <w:r>
+              <w:rPr>
+                <w:b/>
+                <w:sz w:val="20"/>
+                <w:szCs w:val="20"/>
+              </w:rPr>
+              <w:t>(s):</w:t>
+            </w:r>
+          </w:p>
+        </w:tc>
+        <w:tc>
+          <w:tcPr>
+            <w:tcW w:w="1668" w:type="dxa"/>
+          </w:tcPr>
+          <w:p>
+            <w:pPr>
+              <w:rPr>
+                <w:i/>
+                <w:sz w:val="20"/>
+                <w:szCs w:val="20"/>
+              </w:rPr>
+            </w:pPr>
+            <w:r>
+              <w:rPr>
+                <w:i/>
+                <w:sz w:val="20"/>
+                <w:szCs w:val="20"/>
+              </w:rPr>
+              <w:t>4</w:t>
+            </w:r>
+            <w:r>
+              <w:rPr>
+                <w:i/>
+                <w:sz w:val="20"/>
+                <w:szCs w:val="20"/>
+              </w:rPr>
+              <w:t>0%</w:t>
+            </w:r>
+          </w:p>
+        </w:tc>
+      </w:tr>
+      <w:tr>
+        <w:tc>
+          <w:tcPr>
+            <w:tcW w:w="2088" w:type="dxa"/>
+          </w:tcPr>
+          <w:p>
+            <w:pPr>
+              <w:rPr>
+                <w:b/>
+                <w:sz w:val="20"/>
+                <w:szCs w:val="20"/>
+              </w:rPr>
+            </w:pPr>
+            <w:proofErr w:type="spellStart"/>
+            <w:r>
+              <w:rPr>
+                <w:b/>
+                <w:sz w:val="20"/>
+                <w:szCs w:val="20"/>
+              </w:rPr>
+              <w:t>Assignment</w:t>
+            </w:r>
+            <w:proofErr w:type="spellEnd"/>
+            <w:r>
+              <w:rPr>
+                <w:b/>
+                <w:sz w:val="20"/>
+                <w:szCs w:val="20"/>
+              </w:rPr>
+              <w:t xml:space="preserve"> Title:</w:t>
+            </w:r>
+          </w:p>
+        </w:tc>
+        <w:tc>
+          <w:tcPr>
+            <w:tcW w:w="6379" w:type="dxa"/>
+            <w:gridSpan w:val="3"/>
+          </w:tcPr>
+          <w:p>
+            <w:pPr>
+              <w:rPr>
+                <w:i/>
+                <w:sz w:val="20"/>
+                <w:szCs w:val="20"/>
+              </w:rPr>
+            </w:pPr>
+            <w:r>
+              <w:rPr>
+                <w:i/>
+                <w:sz w:val="20"/>
+                <w:szCs w:val="20"/>
+              </w:rPr>
+              <w:t>CA1</w:t>
+            </w:r>
+          </w:p>
+        </w:tc>
+      </w:tr>
+      <w:tr>
+        <w:tc>
+          <w:tcPr>
+            <w:tcW w:w="2088" w:type="dxa"/>
+          </w:tcPr>
+          <w:p>
+            <w:pPr>
+              <w:rPr>
+                <w:b/>
+                <w:sz w:val="20"/>
+                <w:szCs w:val="20"/>
+              </w:rPr>
+            </w:pPr>
+            <w:proofErr w:type="spellStart"/>
+            <w:r>
+              <w:rPr>
+                <w:b/>
+                <w:sz w:val="20"/>
+                <w:szCs w:val="20"/>
+              </w:rPr>
+              <w:t>Lecturer</w:t>
+            </w:r>
+            <w:proofErr w:type="spellEnd"/>
+            <w:r>
+              <w:rPr>
+                <w:b/>
+                <w:sz w:val="20"/>
+                <w:szCs w:val="20"/>
+              </w:rPr>
+              <w:t>(s)</w:t>
+            </w:r>
+            <w:r>
+              <w:rPr>
+                <w:sz w:val="20"/>
+                <w:szCs w:val="20"/>
+              </w:rPr>
+              <w:t>:</w:t>
+            </w:r>
+          </w:p>
+        </w:tc>
+        <w:tc>
+          <w:tcPr>
+            <w:tcW w:w="6379" w:type="dxa"/>
+            <w:gridSpan w:val="3"/>
+          </w:tcPr>
+          <w:p>
+            <w:pPr>
+              <w:rPr>
+                <w:i/>
+                <w:sz w:val="20"/>
+                <w:szCs w:val="20"/>
+              </w:rPr>
+            </w:pPr>
+            <w:proofErr w:type="spellStart"/>
+            <w:r>
+              <w:rPr>
+                <w:i/>
+                <w:sz w:val="20"/>
+                <w:szCs w:val="20"/>
+              </w:rPr>
+              <w:t>Taufique</w:t>
+            </w:r>
+            <w:proofErr w:type="spellEnd"/>
+            <w:r>
+              <w:rPr>
+                <w:i/>
+                <w:sz w:val="20"/>
+                <w:szCs w:val="20"/>
+              </w:rPr>
+              <w:t xml:space="preserve"> Ahmed</w:t>
+            </w:r>
+          </w:p>
+        </w:tc>
+      </w:tr>
+      <w:tr>
+        <w:tc>
+          <w:tcPr>
+            <w:tcW w:w="2088" w:type="dxa"/>
+          </w:tcPr>
+          <w:p>
+            <w:pPr>
+              <w:rPr>
+                <w:b/>
+                <w:sz w:val="20"/>
+                <w:szCs w:val="20"/>
+              </w:rPr>
+            </w:pPr>
+            <w:proofErr w:type="spellStart"/>
+            <w:r>
+              <w:rPr>
+                <w:b/>
+                <w:sz w:val="20"/>
+                <w:szCs w:val="20"/>
+              </w:rPr>
+              <w:t>Issue</w:t>
+            </w:r>
+            <w:proofErr w:type="spellEnd"/>
+            <w:r>
+              <w:rPr>
+                <w:b/>
+                <w:sz w:val="20"/>
+                <w:szCs w:val="20"/>
+              </w:rPr>
+              <w:t xml:space="preserve"> Date:</w:t>
+            </w:r>
+          </w:p>
+        </w:tc>
+        <w:tc>
+          <w:tcPr>
+            <w:tcW w:w="6379" w:type="dxa"/>
+            <w:gridSpan w:val="3"/>
+          </w:tcPr>
+          <w:p>
+            <w:pPr>
+              <w:rPr>
+                <w:i/>
+              </w:rPr>
+            </w:pPr>
+            <w:r>
+              <w:rPr>
+                <w:i/>
+              </w:rPr>
+              <w:t>28-09-2026</w:t>
+            </w:r>
+          </w:p>
+        </w:tc>
+      </w:tr>
+      <w:tr>
+        <w:tc>
+          <w:tcPr>
+            <w:tcW w:w="2088" w:type="dxa"/>
+          </w:tcPr>
+          <w:p>
+            <w:pPr>
+              <w:rPr>
+                <w:b/>
+                <w:sz w:val="20"/>
+                <w:szCs w:val="20"/>
+              </w:rPr>
+            </w:pPr>
+            <w:proofErr w:type="spellStart"/>
+            <w:r>
+              <w:rPr>
+                <w:b/>
+                <w:sz w:val="20"/>
+                <w:szCs w:val="20"/>
+              </w:rPr>
+              <w:t>Submission</w:t>
+            </w:r>
+            <w:proofErr w:type="spellEnd"/>
+            <w:r>
+              <w:rPr>
+                <w:b/>
+                <w:sz w:val="20"/>
+                <w:szCs w:val="20"/>
+              </w:rPr>
+              <w:t xml:space="preserve"> </w:t>
+            </w:r>
+            <w:proofErr w:type="spellStart"/>
+            <w:r>
+              <w:rPr>
+                <w:b/>
+                <w:sz w:val="20"/>
+                <w:szCs w:val="20"/>
+              </w:rPr>
+              <w:t>Deadline</w:t>
+            </w:r>
+            <w:proofErr w:type="spellEnd"/>
+            <w:r>
+              <w:rPr>
+                <w:b/>
+                <w:sz w:val="20"/>
+                <w:szCs w:val="20"/>
+              </w:rPr>
+              <w:t xml:space="preserve"> Date:</w:t>
+            </w:r>
+          </w:p>
+        </w:tc>
+        <w:tc>
+          <w:tcPr>
+            <w:tcW w:w="6379" w:type="dxa"/>
+            <w:gridSpan w:val="3"/>
+          </w:tcPr>
+          <w:p>
+            <w:pPr>
+              <w:rPr>
+                <w:i/>
+                <w:sz w:val="20"/>
+                <w:szCs w:val="20"/>
+              </w:rPr>
+            </w:pPr>
+            <w:r>
+              <w:rPr>
+                <w:i/>
+                <w:sz w:val="20"/>
+                <w:szCs w:val="20"/>
+              </w:rPr>
+              <w:t>01-11-2026 23:59</w:t>
+            </w:r>
+          </w:p>
+        </w:tc>
+      </w:tr>
+      <w:tr>
+        <w:tc>
+          <w:tcPr>
+            <w:tcW w:w="2088" w:type="dxa"/>
+          </w:tcPr>
+          <w:p>
+            <w:pPr>
+              <w:rPr>
+                <w:b/>
+                <w:sz w:val="20"/>
+                <w:szCs w:val="20"/>
+              </w:rPr>
+            </w:pPr>
+            <w:r>
+              <w:rPr>
+                <w:b/>
+                <w:sz w:val="20"/>
+                <w:szCs w:val="20"/>
+              </w:rPr>
+              <w:t xml:space="preserve">GitHub </w:t>
+            </w:r>
+            <w:proofErr w:type="gramStart"/>
+            <w:r>
+              <w:rPr>
+                <w:b/>
+                <w:sz w:val="20"/>
+                <w:szCs w:val="20"/>
+              </w:rPr>
+              <w:t>Link</w:t>
+            </w:r>
+            <w:proofErr w:type="gramEnd"/>
+          </w:p>
+        </w:tc>
+        <w:tc>
+          <w:tcPr>
+            <w:tcW w:w="6379" w:type="dxa"/>
+            <w:gridSpan w:val="3"/>
+          </w:tcPr>
+          <w:p>
+            <w:pPr>
+              <w:rPr>
+                <w:i/>
+                <w:sz w:val="20"/>
+                <w:szCs w:val="20"/>
+                <w:lang w:val="en-GB"/>
+              </w:rPr>
+            </w:pPr>
+            <w:hyperlink r:id="rId5" w:history="1">
+              <w:proofErr w:type="spellStart"/>
+              <w:r>
+                <w:rPr>
+                  <w:rStyle w:val="Hipervnculo"/>
+                  <w:i/>
+                  <w:sz w:val="20"/>
+                  <w:szCs w:val="20"/>
+                  <w:lang w:val="en-GB"/>
+                </w:rPr>
+                <w:t>licalexxibarrola</w:t>
+              </w:r>
+              <w:proofErr w:type="spellEnd"/>
+              <w:r>
+                <w:rPr>
+                  <w:rStyle w:val="Hipervnculo"/>
+                  <w:i/>
+                  <w:sz w:val="20"/>
+                  <w:szCs w:val="20"/>
+                  <w:lang w:val="en-GB"/>
+                </w:rPr>
+                <w:t>-sketch/CA1-Statistical-Techniques</w:t>
+              </w:r>
+            </w:hyperlink>
+          </w:p>
+        </w:tc>
+      </w:tr>
+      <w:tr>
+        <w:tc>
+          <w:tcPr>
+            <w:tcW w:w="2088" w:type="dxa"/>
+          </w:tcPr>
+          <w:p>
+            <w:pPr>
+              <w:rPr>
+                <w:b/>
+                <w:sz w:val="20"/>
+                <w:szCs w:val="20"/>
+              </w:rPr>
+            </w:pPr>
+            <w:proofErr w:type="gramStart"/>
+            <w:r>
+              <w:rPr>
+                <w:b/>
+                <w:sz w:val="20"/>
+                <w:szCs w:val="20"/>
+              </w:rPr>
+              <w:t>Link</w:t>
+            </w:r>
+            <w:proofErr w:type="gramEnd"/>
+            <w:r>
+              <w:rPr>
+                <w:b/>
+                <w:sz w:val="20"/>
+                <w:szCs w:val="20"/>
+              </w:rPr>
+              <w:t xml:space="preserve"> </w:t>
+            </w:r>
+            <w:proofErr w:type="spellStart"/>
+            <w:r>
+              <w:rPr>
+                <w:b/>
+                <w:sz w:val="20"/>
+                <w:szCs w:val="20"/>
+              </w:rPr>
+              <w:t>for</w:t>
+            </w:r>
+            <w:proofErr w:type="spellEnd"/>
+            <w:r>
+              <w:rPr>
+                <w:b/>
+                <w:sz w:val="20"/>
+                <w:szCs w:val="20"/>
+              </w:rPr>
+              <w:t xml:space="preserve"> </w:t>
+            </w:r>
+            <w:proofErr w:type="spellStart"/>
+            <w:r>
+              <w:rPr>
+                <w:b/>
+                <w:sz w:val="20"/>
+                <w:szCs w:val="20"/>
+              </w:rPr>
+              <w:t>the</w:t>
+            </w:r>
+            <w:proofErr w:type="spellEnd"/>
+            <w:r>
+              <w:rPr>
+                <w:b/>
+                <w:sz w:val="20"/>
+                <w:szCs w:val="20"/>
+              </w:rPr>
+              <w:t xml:space="preserve"> </w:t>
+            </w:r>
+            <w:proofErr w:type="spellStart"/>
+            <w:r>
+              <w:rPr>
+                <w:b/>
+                <w:sz w:val="20"/>
+                <w:szCs w:val="20"/>
+              </w:rPr>
+              <w:t>dataset</w:t>
+            </w:r>
+            <w:proofErr w:type="spellEnd"/>
+            <w:r>
+              <w:rPr>
+                <w:b/>
+                <w:sz w:val="20"/>
+                <w:szCs w:val="20"/>
+              </w:rPr>
+              <w:t>:</w:t>
+            </w:r>
+          </w:p>
+        </w:tc>
+        <w:tc>
+          <w:tcPr>
+            <w:tcW w:w="6379" w:type="dxa"/>
+            <w:gridSpan w:val="3"/>
+          </w:tcPr>
+          <w:p>
+            <w:pPr>
+              <w:rPr>
+                <w:i/>
+                <w:sz w:val="20"/>
+                <w:szCs w:val="20"/>
+                <w:lang w:val="en-GB"/>
+              </w:rPr>
+            </w:pPr>
+          </w:p>
+        </w:tc>
+      </w:tr>
+    </w:tbl>
+    <w:p>
+      <w:pPr>
+        <w:jc w:val="center"/>
+      </w:pPr>
     </w:p>
     <w:sectPr>
       <w:pgSz w:w="12240" w:h="15840"/>
@@ -620,7 +1618,6 @@
   <w:style w:type="character" w:default="1" w:styleId="Fuentedeprrafopredeter">
     <w:name w:val="Default Paragraph Font"/>
     <w:uiPriority w:val="1"/>
-    <w:semiHidden/>
     <w:unhideWhenUsed/>
   </w:style>
   <w:style w:type="table" w:default="1" w:styleId="Tablanormal">
@@ -932,6 +1929,29 @@
       <w:smallCaps/>
       <w:color w:val="0F4761" w:themeColor="accent1" w:themeShade="BF"/>
       <w:spacing w:val="5"/>
+    </w:rPr>
+  </w:style>
+  <w:style w:type="character" w:styleId="Hipervnculo">
+    <w:name w:val="Hyperlink"/>
+    <w:basedOn w:val="Fuentedeprrafopredeter"/>
+    <w:uiPriority w:val="99"/>
+    <w:unhideWhenUsed/>
+    <w:rsid w:val="0007391C"/>
+    <w:rPr>
+      <w:color w:val="467886" w:themeColor="hyperlink"/>
+      <w:u w:val="single"/>
+    </w:rPr>
+  </w:style>
+  <w:style w:type="character" w:styleId="Mencinsinresolver">
+    <w:name w:val="Unresolved Mention"/>
+    <w:basedOn w:val="Fuentedeprrafopredeter"/>
+    <w:uiPriority w:val="99"/>
+    <w:semiHidden/>
+    <w:unhideWhenUsed/>
+    <w:rsid w:val="0007391C"/>
+    <w:rPr>
+      <w:color w:val="605E5C"/>
+      <w:shd w:val="clear" w:color="auto" w:fill="E1DFDD"/>
     </w:rPr>
   </w:style>
 </w:styles>

</xml_diff>